<commit_message>
feat: replace editable bar chart labels with fixed codes and add comment fields
- Chart 1 labels fixed to C, R, O, W, D; Chart 2 expanded to 5 bars with labels EVA, EXP, ALT, RP, NF
- Labels rendered inline below bars (no numbered legend)
- Add barChart1Comment/barChart2Comment fields to SummaryData; editable in coach, read-only in teacher
- Layout: bar chart → comment box → bar chart → comment box
- Add scripts/rename-apps.js to auto-rename .app bundles with version + arch suffix after npm run package
- Update distribution guide with versioned .app entries and direct-use instructions
- Update CLAUDE.md with artifact naming table and Windows build command

Co-Authored-By: Claude Sonnet 4.6 <noreply@anthropic.com>
</commit_message>
<xml_diff>
--- a/Video Coaching Feedback - Distribution Guide.docx
+++ b/Video Coaching Feedback - Distribution Guide.docx
@@ -131,6 +131,50 @@
           </w:p>
         </w:tc>
       </w:tr>
+      <w:tr>
+        <w:tc>
+          <w:tcPr>
+            <w:tcW w:type="dxa" w:w="4320"/>
+          </w:tcPr>
+          <w:p>
+            <w:r>
+              <w:t>Mac — Apple Silicon (M1/M2/M3) — unpacked app</w:t>
+            </w:r>
+          </w:p>
+        </w:tc>
+        <w:tc>
+          <w:tcPr>
+            <w:tcW w:type="dxa" w:w="4320"/>
+          </w:tcPr>
+          <w:p>
+            <w:r>
+              <w:t>Video Coaching Feedback - Coach-1.0.1-arm64.app</w:t>
+            </w:r>
+          </w:p>
+        </w:tc>
+      </w:tr>
+      <w:tr>
+        <w:tc>
+          <w:tcPr>
+            <w:tcW w:type="dxa" w:w="4320"/>
+          </w:tcPr>
+          <w:p>
+            <w:r>
+              <w:t>Mac — Intel — unpacked app</w:t>
+            </w:r>
+          </w:p>
+        </w:tc>
+        <w:tc>
+          <w:tcPr>
+            <w:tcW w:type="dxa" w:w="4320"/>
+          </w:tcPr>
+          <w:p>
+            <w:r>
+              <w:t>Video Coaching Feedback - Coach-1.0.1.app</w:t>
+            </w:r>
+          </w:p>
+        </w:tc>
+      </w:tr>
     </w:tbl>
     <w:p/>
     <w:p>
@@ -179,6 +223,22 @@
       </w:pPr>
       <w:r>
         <w:t>Click "Open" in the confirmation dialog.</w:t>
+      </w:r>
+    </w:p>
+    <w:p>
+      <w:pPr>
+        <w:pStyle w:val="Heading3"/>
+      </w:pPr>
+      <w:r>
+        <w:t>Mac — .app (Direct Use)</w:t>
+      </w:r>
+    </w:p>
+    <w:p>
+      <w:pPr>
+        <w:pStyle w:val="ListNumber"/>
+      </w:pPr>
+      <w:r>
+        <w:t>The .app file requires no installation. Copy "Video Coaching Feedback - Coach.app" from the mac or mac-arm64 folder to anywhere on your Mac (e.g. Applications), then double-click to open it directly.</w:t>
       </w:r>
     </w:p>
     <w:p>
@@ -328,6 +388,50 @@
           </w:p>
         </w:tc>
       </w:tr>
+      <w:tr>
+        <w:tc>
+          <w:tcPr>
+            <w:tcW w:type="dxa" w:w="4320"/>
+          </w:tcPr>
+          <w:p>
+            <w:r>
+              <w:t>Mac — Apple Silicon (M1/M2/M3) — unpacked app</w:t>
+            </w:r>
+          </w:p>
+        </w:tc>
+        <w:tc>
+          <w:tcPr>
+            <w:tcW w:type="dxa" w:w="4320"/>
+          </w:tcPr>
+          <w:p>
+            <w:r>
+              <w:t>Video Coaching Feedback - Teacher-1.0.1-arm64.app</w:t>
+            </w:r>
+          </w:p>
+        </w:tc>
+      </w:tr>
+      <w:tr>
+        <w:tc>
+          <w:tcPr>
+            <w:tcW w:type="dxa" w:w="4320"/>
+          </w:tcPr>
+          <w:p>
+            <w:r>
+              <w:t>Mac — Intel — unpacked app</w:t>
+            </w:r>
+          </w:p>
+        </w:tc>
+        <w:tc>
+          <w:tcPr>
+            <w:tcW w:type="dxa" w:w="4320"/>
+          </w:tcPr>
+          <w:p>
+            <w:r>
+              <w:t>Video Coaching Feedback - Teacher-1.0.1.app</w:t>
+            </w:r>
+          </w:p>
+        </w:tc>
+      </w:tr>
     </w:tbl>
     <w:p/>
     <w:p>
@@ -376,6 +480,22 @@
       </w:pPr>
       <w:r>
         <w:t>Click "Open" in the confirmation dialog.</w:t>
+      </w:r>
+    </w:p>
+    <w:p>
+      <w:pPr>
+        <w:pStyle w:val="Heading3"/>
+      </w:pPr>
+      <w:r>
+        <w:t>Mac — .app (Direct Use)</w:t>
+      </w:r>
+    </w:p>
+    <w:p>
+      <w:pPr>
+        <w:pStyle w:val="ListNumber"/>
+      </w:pPr>
+      <w:r>
+        <w:t>The .app file requires no installation. Copy "Video Coaching Feedback - Teacher.app" from the mac or mac-arm64 folder to anywhere on your Mac (e.g. Applications), then double-click to open it directly.</w:t>
       </w:r>
     </w:p>
     <w:p>

</xml_diff>